<commit_message>
README + SI: '20 source databases' -> '20 source databases and resources' (H04) across all artifacts
</commit_message>
<xml_diff>
--- a/docs/manuscript/RCDome_manuscript_V027_supplementary_information.docx
+++ b/docs/manuscript/RCDome_manuscript_V027_supplementary_information.docx
@@ -15257,7 +15257,7 @@
           <w:szCs w:val="24"/>
           <w:highlight w:val="green"/>
         </w:rPr>
-        <w:t>Supplementary Figure S2</w:t>
+        <w:t>Supplementary Figure S2. Database contribution and multi-database corroboration. (A) Number of gene–RCD associations contributed by each of the 20 source databases and resources (log2-scaled axis; exact counts printed at the end of each bar). (B) Number of source databases per association: 10,009 associations rest on a single source, 6,313 are corroborated by two sources, and the count declines steeply with additional sources; the long tail up to 14 sources marks the best-corroborated associations (e.g., the canonical executors), which carry the strongest multi-database agreement.</w:t>
       </w:r>
       <w:r>
         <w:rPr>
@@ -15266,7 +15266,6 @@
           <w:color w:val="auto"/>
           <w:szCs w:val="24"/>
         </w:rPr>
-        <w:t>. Database contribution and multi-database corroboration.</w:t>
       </w:r>
       <w:r>
         <w:rPr>
@@ -15275,7 +15274,6 @@
           <w:color w:val="auto"/>
           <w:szCs w:val="24"/>
         </w:rPr>
-        <w:t xml:space="preserve"> (A) Number of gene–RCD associations contributed by each of the 20 source databases (log2-scaled axis; exact counts printed at the end of each bar). (B) Number of source databases per association: 10,009 associations rest on a single source, 6,313 are corroborated by two sources, and the count declines steeply with additional sources; the long tail up to 14 sources marks the best-corroborated </w:t>
       </w:r>
       <w:r>
         <w:rPr>
@@ -15284,8 +15282,6 @@
           <w:color w:val="auto"/>
           <w:szCs w:val="24"/>
         </w:rPr>
-        <w:lastRenderedPageBreak/>
-        <w:t>associations (e.g., the canonical executors), which carry the strongest multi-database agreement.</w:t>
       </w:r>
     </w:p>
     <w:p>

</xml_diff>

<commit_message>
Include all 6 Emanuell prompts verbatim in SI (add S5 legend + S6 logo); call out S3/S5/S6/S4 in manuscript
</commit_message>
<xml_diff>
--- a/docs/manuscript/RCDome_manuscript_V027_supplementary_information.docx
+++ b/docs/manuscript/RCDome_manuscript_V027_supplementary_information.docx
@@ -15145,6 +15145,3312 @@
           <w:szCs w:val="32"/>
         </w:rPr>
       </w:pPr>
+    </w:p>
+    <w:p>
+      <w:pPr>
+        <w:pStyle w:val="Ttulo2"/>
+      </w:pPr>
+      <w:r>
+        <w:t>Supplementary Prompt S5. Figure-legend generation framework</w:t>
+      </w:r>
+    </w:p>
+    <w:p>
+      <w:pPr>
+        <w:spacing w:after="0"/>
+      </w:pPr>
+      <w:r>
+        <w:t># PROMPT: FIGURE LEGEND GENERATION FOR REGULATED CELL DEATH (RCD) ILLUSTRATIONS</w:t>
+      </w:r>
+    </w:p>
+    <w:p>
+      <w:pPr/>
+    </w:p>
+    <w:p>
+      <w:pPr>
+        <w:spacing w:after="0"/>
+      </w:pPr>
+      <w:r>
+        <w:t>You are a senior scientific editor and author specializing in regulated cell death (RCD), writing at the standard of *Nature Cell Biology*, *Cell Death &amp; Differentiation*, *Molecular Cell*, and *Nature Reviews Cancer*. Your task is to write a publication-ready figure legend for the scientific illustration provided, following the technical conventions of scientific writing described in *How to Write and Publish a Scientific Paper* (Gastel &amp; Day).</w:t>
+      </w:r>
+    </w:p>
+    <w:p>
+      <w:pPr/>
+    </w:p>
+    <w:p>
+      <w:pPr>
+        <w:spacing w:after="0"/>
+      </w:pPr>
+      <w:r>
+        <w:t>## INPUTS (all three are mandatory)</w:t>
+      </w:r>
+    </w:p>
+    <w:p>
+      <w:pPr/>
+    </w:p>
+    <w:p>
+      <w:pPr>
+        <w:spacing w:after="0"/>
+      </w:pPr>
+      <w:r>
+        <w:t>1. **FIGURE:** the attached image of the mechanism.</w:t>
+      </w:r>
+    </w:p>
+    <w:p>
+      <w:pPr>
+        <w:spacing w:after="0"/>
+      </w:pPr>
+      <w:r>
+        <w:t>2. **FIGURE-GENERATION PROMPT:** the prompt used to create the figure (visual conventions: arrow types, color logic, inset "Cancer Context", gray dashed crosstalk, left-to-right/top-to-bottom flow).</w:t>
+      </w:r>
+    </w:p>
+    <w:p>
+      <w:pPr>
+        <w:spacing w:after="0"/>
+      </w:pPr>
+      <w:r>
+        <w:t xml:space="preserve">   [PASTE OR REFERENCE THE FIGURE-CREATION PROMPT]</w:t>
+      </w:r>
+    </w:p>
+    <w:p>
+      <w:pPr>
+        <w:spacing w:after="0"/>
+      </w:pPr>
+      <w:r>
+        <w:t>3. **MECHANISM DESCRIPTION:** the text used as the [CONCEPT TO ILLUSTRATE].</w:t>
+      </w:r>
+    </w:p>
+    <w:p>
+      <w:pPr>
+        <w:spacing w:after="0"/>
+      </w:pPr>
+      <w:r>
+        <w:t xml:space="preserve">   [PASTE MECHANISM DESCRIPTION HERE]</w:t>
+      </w:r>
+    </w:p>
+    <w:p>
+      <w:pPr/>
+    </w:p>
+    <w:p>
+      <w:pPr>
+        <w:spacing w:after="0"/>
+      </w:pPr>
+      <w:r>
+        <w:t>**RCD PATHWAY:** [e.g., Ferroptosis / Alkaliptosis / Disulfidptosis / Necroptosis / Pyroptosis / PANoptosis ...]</w:t>
+      </w:r>
+    </w:p>
+    <w:p>
+      <w:pPr>
+        <w:spacing w:after="0"/>
+      </w:pPr>
+      <w:r>
+        <w:t>**TARGET JOURNAL (optional):** [journal name]</w:t>
+      </w:r>
+    </w:p>
+    <w:p>
+      <w:pPr>
+        <w:spacing w:after="0"/>
+      </w:pPr>
+      <w:r>
+        <w:t>**WORD LIMIT (optional):** [e.g., 250–350 words; if not specified, aim for 200–350 words]</w:t>
+      </w:r>
+    </w:p>
+    <w:p>
+      <w:pPr>
+        <w:spacing w:after="0"/>
+      </w:pPr>
+      <w:r>
+        <w:t>**FIGURE NUMBER (optional):** [e.g., Figure 1]</w:t>
+      </w:r>
+    </w:p>
+    <w:p>
+      <w:pPr/>
+    </w:p>
+    <w:p>
+      <w:pPr>
+        <w:spacing w:after="0"/>
+      </w:pPr>
+      <w:r>
+        <w:t>## SOURCE HIERARCHY AND ANTI-HALLUCINATION RULES</w:t>
+      </w:r>
+    </w:p>
+    <w:p>
+      <w:pPr/>
+    </w:p>
+    <w:p>
+      <w:pPr>
+        <w:spacing w:after="0"/>
+      </w:pPr>
+      <w:r>
+        <w:t>- Use ONLY information present in the figure and the mechanism description. Do not add molecules, steps, drugs, citations, or claims that appear in neither.</w:t>
+      </w:r>
+    </w:p>
+    <w:p>
+      <w:pPr>
+        <w:spacing w:after="0"/>
+      </w:pPr>
+      <w:r>
+        <w:t>- If the figure and the description disagree (a label, arrow type, component, or localization), do NOT silently choose one. Follow the mechanism description for biological content, follow the figure for what is physically displayed, and report every discrepancy in the "Discrepancy Report" (see output).</w:t>
+      </w:r>
+    </w:p>
+    <w:p>
+      <w:pPr>
+        <w:spacing w:after="0"/>
+      </w:pPr>
+      <w:r>
+        <w:t>- Preserve the evidentiary qualifiers present in the figure or description ("proposed", "candidate", "context-dependent", "conceptual", "not established", "preliminary", "not required for initiation"). Never convert a hedged claim into an established one. Never upgrade correlation to causation.</w:t>
+      </w:r>
+    </w:p>
+    <w:p>
+      <w:pPr>
+        <w:spacing w:after="0"/>
+      </w:pPr>
+      <w:r>
+        <w:t>- Do not invent citations, PMIDs, or reference numbers. Place "(refs)" markers only if the user explicitly requests them.</w:t>
+      </w:r>
+    </w:p>
+    <w:p>
+      <w:pPr/>
+    </w:p>
+    <w:p>
+      <w:pPr>
+        <w:spacing w:after="0"/>
+      </w:pPr>
+      <w:r>
+        <w:t>## STRUCTURE OF THE LEGEND (follow this order)</w:t>
+      </w:r>
+    </w:p>
+    <w:p>
+      <w:pPr/>
+    </w:p>
+    <w:p>
+      <w:pPr>
+        <w:spacing w:after="0"/>
+      </w:pPr>
+      <w:r>
+        <w:t>**1. Title (bold, one sentence, ≤ 20 words).** Informative and specific to the pathway, stating the main message of the figure, not merely naming the topic (e.g., "Ferroptosis is driven by iron-dependent phospholipid peroxidation when GPX4-independent defenses fail"). No period issues, no abbreviations unless universally known.</w:t>
+      </w:r>
+    </w:p>
+    <w:p>
+      <w:pPr/>
+    </w:p>
+    <w:p>
+      <w:pPr>
+        <w:spacing w:after="0"/>
+      </w:pPr>
+      <w:r>
+        <w:t>**2. Overview sentence (1–2 sentences).** State what the figure shows as a whole: the trigger, the executor/mechanism of death, and the outcome. Use the present tense for the model (schematic figures depict established or proposed models, not experimental results).</w:t>
+      </w:r>
+    </w:p>
+    <w:p>
+      <w:pPr/>
+    </w:p>
+    <w:p>
+      <w:pPr>
+        <w:spacing w:after="0"/>
+      </w:pPr>
+      <w:r>
+        <w:t>**3. Panel-by-panel (or region-by-region) description.** Describe each numbered panel/module in the same sequence as the biological flow of the figure (e.g., induction → regulation → execution → death). For each panel:</w:t>
+      </w:r>
+    </w:p>
+    <w:p>
+      <w:pPr>
+        <w:spacing w:after="0"/>
+      </w:pPr>
+      <w:r>
+        <w:t xml:space="preserve">   - Identify it by its number/letter exactly as shown in the figure (e.g., "(1)", "(a)").</w:t>
+      </w:r>
+    </w:p>
+    <w:p>
+      <w:pPr>
+        <w:spacing w:after="0"/>
+      </w:pPr>
+      <w:r>
+        <w:t xml:space="preserve">   - Name the key molecular actors and their subcellular localization as drawn (plasma membrane, cytosol, lysosome, mitochondrion, nucleus, ER, etc.).</w:t>
+      </w:r>
+    </w:p>
+    <w:p>
+      <w:pPr>
+        <w:spacing w:after="0"/>
+      </w:pPr>
+      <w:r>
+        <w:t xml:space="preserve">   - State causal relationships with correct verbs (activates, inhibits, promotes, is required for, amplifies, is dispensable for), consistent with the arrow types in the figure.</w:t>
+      </w:r>
+    </w:p>
+    <w:p>
+      <w:pPr>
+        <w:spacing w:after="0"/>
+      </w:pPr>
+      <w:r>
+        <w:t xml:space="preserve">   - Clearly distinguish core pathway components from modulators, amplifiers, and non-essential/peripheral events, mirroring how the figure separates them.</w:t>
+      </w:r>
+    </w:p>
+    <w:p>
+      <w:pPr>
+        <w:spacing w:after="0"/>
+      </w:pPr>
+      <w:r>
+        <w:t xml:space="preserve">   - Distinguish activation states when shown (cleaved vs. precursor, phosphorylated, oligomerized, oxidized/reduced).</w:t>
+      </w:r>
+    </w:p>
+    <w:p>
+      <w:pPr/>
+    </w:p>
+    <w:p>
+      <w:pPr>
+        <w:spacing w:after="0"/>
+      </w:pPr>
+      <w:r>
+        <w:t>**4. Crosstalk statement (1–2 sentences).** Describe the connections to other RCD forms exactly as depicted (light gray dashed arrows, peripheral boxes). State explicitly whether crosstalk is validated, reciprocal, conceptual, or absent, and that these are not part of core execution when the figure says so.</w:t>
+      </w:r>
+    </w:p>
+    <w:p>
+      <w:pPr/>
+    </w:p>
+    <w:p>
+      <w:pPr>
+        <w:spacing w:after="0"/>
+      </w:pPr>
+      <w:r>
+        <w:t>**5. Cancer Context statement (1–3 sentences).** Summarize the inset: whether the pathway is exploited for evasion, promotion, or therapy; name only the tumor types, drugs, and targets shown; keep the evidence-level qualifiers (e.g., "best-established", "preclinical", "preliminary/associative").</w:t>
+      </w:r>
+    </w:p>
+    <w:p>
+      <w:pPr/>
+    </w:p>
+    <w:p>
+      <w:pPr>
+        <w:spacing w:after="0"/>
+      </w:pPr>
+      <w:r>
+        <w:t>**6. Symbol and color key (1–2 sentences, placed inside the legend, NOT inside the image).** Define every graphical convention used: solid arrows = activation/flow; flat-head bars = inhibition; dashed arrows = crosstalk or conceptual/indirect relationships; gray dashed = connections to other RCD forms; consistent color for each molecular actor class; any special symbols (P = phosphate, S–S = disulfide bond, red cross = blocked/not required, "?" = uncertain/unestablished). Include only conventions actually present in the figure.</w:t>
+      </w:r>
+    </w:p>
+    <w:p>
+      <w:pPr/>
+    </w:p>
+    <w:p>
+      <w:pPr>
+        <w:spacing w:after="0"/>
+      </w:pPr>
+      <w:r>
+        <w:t>**7. Abbreviations.** Define every abbreviation at first use in the legend or, if more than ~8 are needed, provide a single alphabetized sentence at the end: "Abbreviations: ...". Use official HGNC gene/protein symbols as they appear in the figure (italicize gene symbols only if the figure treats them as genes; keep protein symbols in roman type). Follow current NCCD nomenclature for cell death terms and do not use distinct processes as synonyms (e.g., necrosis vs. necroptosis).</w:t>
+      </w:r>
+    </w:p>
+    <w:p>
+      <w:pPr/>
+    </w:p>
+    <w:p>
+      <w:pPr>
+        <w:spacing w:after="0"/>
+      </w:pPr>
+      <w:r>
+        <w:t>**8. Adaptation/attribution line (optional).** If the figure is original and created by the authors, add: "Figure created by the authors." If adapted from other work, add: "Adapted from [source], with permission." Include only if the user supplies this information.</w:t>
+      </w:r>
+    </w:p>
+    <w:p>
+      <w:pPr/>
+    </w:p>
+    <w:p>
+      <w:pPr>
+        <w:spacing w:after="0"/>
+      </w:pPr>
+      <w:r>
+        <w:t>## WRITING RULES (Gastel &amp; Day principles)</w:t>
+      </w:r>
+    </w:p>
+    <w:p>
+      <w:pPr/>
+    </w:p>
+    <w:p>
+      <w:pPr>
+        <w:spacing w:after="0"/>
+      </w:pPr>
+      <w:r>
+        <w:t>- The legend must be **self-explanatory**: a reader should understand the figure without reading the main text.</w:t>
+      </w:r>
+    </w:p>
+    <w:p>
+      <w:pPr>
+        <w:spacing w:after="0"/>
+      </w:pPr>
+      <w:r>
+        <w:t>- Be **concise, precise, and non-redundant**: do not repeat information already readable from the labels in the image, do not restate general background, and do not discuss methods or results beyond what the schematic shows.</w:t>
+      </w:r>
+    </w:p>
+    <w:p>
+      <w:pPr>
+        <w:spacing w:after="0"/>
+      </w:pPr>
+      <w:r>
+        <w:t>- Use **simple, direct sentences** and the **present tense** for model descriptions; avoid vague words ("various", "several", "etc.") and avoid unnecessary adjectives or promotional language ("remarkable", "crucial", "novel").</w:t>
+      </w:r>
+    </w:p>
+    <w:p>
+      <w:pPr>
+        <w:spacing w:after="0"/>
+      </w:pPr>
+      <w:r>
+        <w:t>- Use consistent terminology with the figure: the same name for the same entity throughout.</w:t>
+      </w:r>
+    </w:p>
+    <w:p>
+      <w:pPr>
+        <w:spacing w:after="0"/>
+      </w:pPr>
+      <w:r>
+        <w:t>- Write full words for pathway names at first use, with the abbreviation in parentheses.</w:t>
+      </w:r>
+    </w:p>
+    <w:p>
+      <w:pPr>
+        <w:spacing w:after="0"/>
+      </w:pPr>
+      <w:r>
+        <w:t>- Use correct units, ion notation (Ca²⁺, Fe²⁺, H⁺, HCO₃⁻), and symbols (↑, ↓, →, ⊣) consistently.</w:t>
+      </w:r>
+    </w:p>
+    <w:p>
+      <w:pPr>
+        <w:spacing w:after="0"/>
+      </w:pPr>
+      <w:r>
+        <w:t>- Do not include a "Figure X." prefix duplication; if a figure number is provided, begin with it in bold followed by the title.</w:t>
+      </w:r>
+    </w:p>
+    <w:p>
+      <w:pPr>
+        <w:spacing w:after="0"/>
+      </w:pPr>
+      <w:r>
+        <w:t>- Respect the word limit; if the content cannot fit, prioritize in this order: core pathway → regulation/modulators → cancer context → crosstalk → abbreviations.</w:t>
+      </w:r>
+    </w:p>
+    <w:p>
+      <w:pPr/>
+    </w:p>
+    <w:p>
+      <w:pPr>
+        <w:spacing w:after="0"/>
+      </w:pPr>
+      <w:r>
+        <w:t>## OUTPUT FORMAT (mandatory)</w:t>
+      </w:r>
+    </w:p>
+    <w:p>
+      <w:pPr/>
+    </w:p>
+    <w:p>
+      <w:pPr>
+        <w:spacing w:after="0"/>
+      </w:pPr>
+      <w:r>
+        <w:t>**A. FINAL FIGURE LEGEND**</w:t>
+      </w:r>
+    </w:p>
+    <w:p>
+      <w:pPr>
+        <w:spacing w:after="0"/>
+      </w:pPr>
+      <w:r>
+        <w:t>The complete legend, ready to paste into a manuscript, as continuous prose (title in bold, then paragraph text; no bullet points inside the legend).</w:t>
+      </w:r>
+    </w:p>
+    <w:p>
+      <w:pPr/>
+    </w:p>
+    <w:p>
+      <w:pPr>
+        <w:spacing w:after="0"/>
+      </w:pPr>
+      <w:r>
+        <w:t>**B. ABBREVIATIONS** (only if not already integrated into the legend)</w:t>
+      </w:r>
+    </w:p>
+    <w:p>
+      <w:pPr/>
+    </w:p>
+    <w:p>
+      <w:pPr>
+        <w:spacing w:after="0"/>
+      </w:pPr>
+      <w:r>
+        <w:t>**C. DISCREPANCY REPORT**</w:t>
+      </w:r>
+    </w:p>
+    <w:p>
+      <w:pPr>
+        <w:spacing w:after="0"/>
+      </w:pPr>
+      <w:r>
+        <w:t>A table with the columns:</w:t>
+      </w:r>
+    </w:p>
+    <w:p>
+      <w:pPr/>
+    </w:p>
+    <w:p>
+      <w:pPr>
+        <w:spacing w:after="0"/>
+      </w:pPr>
+      <w:r>
+        <w:t>| Item | What the figure shows | What the description says | Resolution adopted in the legend | Recommended action (fix in image or in text) |</w:t>
+      </w:r>
+    </w:p>
+    <w:p>
+      <w:pPr>
+        <w:spacing w:after="0"/>
+      </w:pPr>
+      <w:r>
+        <w:t>| --- | --- | --- | --- | --- |</w:t>
+      </w:r>
+    </w:p>
+    <w:p>
+      <w:pPr/>
+    </w:p>
+    <w:p>
+      <w:pPr>
+        <w:spacing w:after="0"/>
+      </w:pPr>
+      <w:r>
+        <w:t>If there are no discrepancies, write: "No discrepancies detected between figure, generation prompt, and mechanism description."</w:t>
+      </w:r>
+    </w:p>
+    <w:p>
+      <w:pPr/>
+    </w:p>
+    <w:p>
+      <w:pPr>
+        <w:spacing w:after="0"/>
+      </w:pPr>
+      <w:r>
+        <w:t>**D. QUALITY CHECKLIST**</w:t>
+      </w:r>
+    </w:p>
+    <w:p>
+      <w:pPr>
+        <w:spacing w:after="0"/>
+      </w:pPr>
+      <w:r>
+        <w:t>Confirm each item with ✅ / ⚠️ and a short note:</w:t>
+      </w:r>
+    </w:p>
+    <w:p>
+      <w:pPr>
+        <w:spacing w:after="0"/>
+      </w:pPr>
+      <w:r>
+        <w:t>- Title is informative and specific</w:t>
+      </w:r>
+    </w:p>
+    <w:p>
+      <w:pPr>
+        <w:spacing w:after="0"/>
+      </w:pPr>
+      <w:r>
+        <w:t>- Panel order follows the biological flow of the figure</w:t>
+      </w:r>
+    </w:p>
+    <w:p>
+      <w:pPr>
+        <w:spacing w:after="0"/>
+      </w:pPr>
+      <w:r>
+        <w:t>- All labeled structures relevant to the mechanism are covered</w:t>
+      </w:r>
+    </w:p>
+    <w:p>
+      <w:pPr>
+        <w:spacing w:after="0"/>
+      </w:pPr>
+      <w:r>
+        <w:t>- All arrow types and colors are explained</w:t>
+      </w:r>
+    </w:p>
+    <w:p>
+      <w:pPr>
+        <w:spacing w:after="0"/>
+      </w:pPr>
+      <w:r>
+        <w:t>- All abbreviations are defined</w:t>
+      </w:r>
+    </w:p>
+    <w:p>
+      <w:pPr>
+        <w:spacing w:after="0"/>
+      </w:pPr>
+      <w:r>
+        <w:t>- Evidence-level qualifiers preserved (no overstatement)</w:t>
+      </w:r>
+    </w:p>
+    <w:p>
+      <w:pPr>
+        <w:spacing w:after="0"/>
+      </w:pPr>
+      <w:r>
+        <w:t>- Crosstalk described as shown (peripheral, not central)</w:t>
+      </w:r>
+    </w:p>
+    <w:p>
+      <w:pPr>
+        <w:spacing w:after="0"/>
+      </w:pPr>
+      <w:r>
+        <w:t>- Cancer Context consistent with the inset</w:t>
+      </w:r>
+    </w:p>
+    <w:p>
+      <w:pPr>
+        <w:spacing w:after="0"/>
+      </w:pPr>
+      <w:r>
+        <w:t>- NCCD-consistent terminology</w:t>
+      </w:r>
+    </w:p>
+    <w:p>
+      <w:pPr>
+        <w:spacing w:after="0"/>
+      </w:pPr>
+      <w:r>
+        <w:t>- No information added beyond figure + description</w:t>
+      </w:r>
+    </w:p>
+    <w:p>
+      <w:pPr>
+        <w:spacing w:after="0"/>
+      </w:pPr>
+      <w:r>
+        <w:t>- Word limit respected (state the final word count)</w:t>
+      </w:r>
+    </w:p>
+    <w:p>
+      <w:pPr/>
+    </w:p>
+    <w:p>
+      <w:pPr>
+        <w:spacing w:after="0"/>
+      </w:pPr>
+      <w:r>
+        <w:t>Be rigorous and conservative: when in doubt, preserve the hedge, flag the issue in the Discrepancy Report, and never add unsupported information.</w:t>
+      </w:r>
+    </w:p>
+    <w:p>
+      <w:pPr>
+        <w:pStyle w:val="Ttulo2"/>
+      </w:pPr>
+      <w:r>
+        <w:t>Supplementary Prompt S6. Logo (icon) creation framework</w:t>
+      </w:r>
+    </w:p>
+    <w:p>
+      <w:pPr>
+        <w:spacing w:after="0"/>
+      </w:pPr>
+      <w:r>
+        <w:t>Create a new image from scratch.</w:t>
+      </w:r>
+    </w:p>
+    <w:p>
+      <w:pPr/>
+    </w:p>
+    <w:p>
+      <w:pPr>
+        <w:spacing w:after="0"/>
+      </w:pPr>
+      <w:r>
+        <w:t>You are a senior biomedical illustrator creating ONE minimalist scientific icon for a coherent collection of Regulated Cell Death (RCD) modalities intended for publication in a high-impact biomedical journal.</w:t>
+      </w:r>
+    </w:p>
+    <w:p>
+      <w:pPr/>
+    </w:p>
+    <w:p>
+      <w:pPr>
+        <w:spacing w:after="0"/>
+      </w:pPr>
+      <w:r>
+        <w:t>You will receive only the biological description of one RCD pathway.</w:t>
+      </w:r>
+    </w:p>
+    <w:p>
+      <w:pPr/>
+    </w:p>
+    <w:p>
+      <w:pPr>
+        <w:spacing w:after="0"/>
+      </w:pPr>
+      <w:r>
+        <w:t>First interpret the biology silently. Then generate the icon directly.</w:t>
+      </w:r>
+    </w:p>
+    <w:p>
+      <w:pPr/>
+    </w:p>
+    <w:p>
+      <w:pPr>
+        <w:spacing w:after="0"/>
+      </w:pPr>
+      <w:r>
+        <w:t>IMPORTANT:</w:t>
+      </w:r>
+    </w:p>
+    <w:p>
+      <w:pPr>
+        <w:spacing w:after="0"/>
+      </w:pPr>
+      <w:r>
+        <w:t>This is NOT a mechanistic pathway diagram.</w:t>
+      </w:r>
+    </w:p>
+    <w:p>
+      <w:pPr>
+        <w:spacing w:after="0"/>
+      </w:pPr>
+      <w:r>
+        <w:t>This is NOT an infographic.</w:t>
+      </w:r>
+    </w:p>
+    <w:p>
+      <w:pPr>
+        <w:spacing w:after="0"/>
+      </w:pPr>
+      <w:r>
+        <w:t>This is NOT a molecular illustration.</w:t>
+      </w:r>
+    </w:p>
+    <w:p>
+      <w:pPr>
+        <w:spacing w:after="0"/>
+      </w:pPr>
+      <w:r>
+        <w:t>This is NOT a logo in the commercial-branding sense.</w:t>
+      </w:r>
+    </w:p>
+    <w:p>
+      <w:pPr/>
+    </w:p>
+    <w:p>
+      <w:pPr>
+        <w:spacing w:after="0"/>
+      </w:pPr>
+      <w:r>
+        <w:t>It is a SIMPLE CELLULAR PICTOGRAM representing the characteristic phenotype or defining biological event of the RCD modality.</w:t>
+      </w:r>
+    </w:p>
+    <w:p>
+      <w:pPr/>
+    </w:p>
+    <w:p>
+      <w:pPr>
+        <w:spacing w:after="0"/>
+      </w:pPr>
+      <w:r>
+        <w:t>==================================================</w:t>
+      </w:r>
+    </w:p>
+    <w:p>
+      <w:pPr>
+        <w:spacing w:after="0"/>
+      </w:pPr>
+      <w:r>
+        <w:t>CORE VISUAL LANGUAGE — MUST REMAIN CONSTANT</w:t>
+      </w:r>
+    </w:p>
+    <w:p>
+      <w:pPr>
+        <w:spacing w:after="0"/>
+      </w:pPr>
+      <w:r>
+        <w:t>==================================================</w:t>
+      </w:r>
+    </w:p>
+    <w:p>
+      <w:pPr/>
+    </w:p>
+    <w:p>
+      <w:pPr>
+        <w:spacing w:after="0"/>
+      </w:pPr>
+      <w:r>
+        <w:t>The entire RCD collection follows the same visual grammar:</w:t>
+      </w:r>
+    </w:p>
+    <w:p>
+      <w:pPr/>
+    </w:p>
+    <w:p>
+      <w:pPr>
+        <w:spacing w:after="0"/>
+      </w:pPr>
+      <w:r>
+        <w:t>- flat 2D vector illustration;</w:t>
+      </w:r>
+    </w:p>
+    <w:p>
+      <w:pPr>
+        <w:spacing w:after="0"/>
+      </w:pPr>
+      <w:r>
+        <w:t>- front-facing or top-down cellular view;</w:t>
+      </w:r>
+    </w:p>
+    <w:p>
+      <w:pPr>
+        <w:spacing w:after="0"/>
+      </w:pPr>
+      <w:r>
+        <w:t>- simple soft cartoon-like biomedical style;</w:t>
+      </w:r>
+    </w:p>
+    <w:p>
+      <w:pPr>
+        <w:spacing w:after="0"/>
+      </w:pPr>
+      <w:r>
+        <w:t>- rounded organic shapes;</w:t>
+      </w:r>
+    </w:p>
+    <w:p>
+      <w:pPr>
+        <w:spacing w:after="0"/>
+      </w:pPr>
+      <w:r>
+        <w:t>- thick, smooth, uniform outlines;</w:t>
+      </w:r>
+    </w:p>
+    <w:p>
+      <w:pPr>
+        <w:spacing w:after="0"/>
+      </w:pPr>
+      <w:r>
+        <w:t>- no perspective;</w:t>
+      </w:r>
+    </w:p>
+    <w:p>
+      <w:pPr>
+        <w:spacing w:after="0"/>
+      </w:pPr>
+      <w:r>
+        <w:t>- no isometric view;</w:t>
+      </w:r>
+    </w:p>
+    <w:p>
+      <w:pPr>
+        <w:spacing w:after="0"/>
+      </w:pPr>
+      <w:r>
+        <w:t>- no 3D;</w:t>
+      </w:r>
+    </w:p>
+    <w:p>
+      <w:pPr>
+        <w:spacing w:after="0"/>
+      </w:pPr>
+      <w:r>
+        <w:t>- no realistic rendering;</w:t>
+      </w:r>
+    </w:p>
+    <w:p>
+      <w:pPr>
+        <w:spacing w:after="0"/>
+      </w:pPr>
+      <w:r>
+        <w:t>- no gradients;</w:t>
+      </w:r>
+    </w:p>
+    <w:p>
+      <w:pPr>
+        <w:spacing w:after="0"/>
+      </w:pPr>
+      <w:r>
+        <w:t>- no shadows;</w:t>
+      </w:r>
+    </w:p>
+    <w:p>
+      <w:pPr>
+        <w:spacing w:after="0"/>
+      </w:pPr>
+      <w:r>
+        <w:t>- no textures;</w:t>
+      </w:r>
+    </w:p>
+    <w:p>
+      <w:pPr>
+        <w:spacing w:after="0"/>
+      </w:pPr>
+      <w:r>
+        <w:t>- pure white background;</w:t>
+      </w:r>
+    </w:p>
+    <w:p>
+      <w:pPr>
+        <w:spacing w:after="0"/>
+      </w:pPr>
+      <w:r>
+        <w:t>- square canvas;</w:t>
+      </w:r>
+    </w:p>
+    <w:p>
+      <w:pPr>
+        <w:spacing w:after="0"/>
+      </w:pPr>
+      <w:r>
+        <w:t>- one centered composition;</w:t>
+      </w:r>
+    </w:p>
+    <w:p>
+      <w:pPr>
+        <w:spacing w:after="0"/>
+      </w:pPr>
+      <w:r>
+        <w:t>- generous white margin;</w:t>
+      </w:r>
+    </w:p>
+    <w:p>
+      <w:pPr>
+        <w:spacing w:after="0"/>
+      </w:pPr>
+      <w:r>
+        <w:t>- simple enough to remain readable at thumbnail size.</w:t>
+      </w:r>
+    </w:p>
+    <w:p>
+      <w:pPr/>
+    </w:p>
+    <w:p>
+      <w:pPr>
+        <w:spacing w:after="0"/>
+      </w:pPr>
+      <w:r>
+        <w:t>The image must look like a member of ONE unified scientific icon family.</w:t>
+      </w:r>
+    </w:p>
+    <w:p>
+      <w:pPr/>
+    </w:p>
+    <w:p>
+      <w:pPr>
+        <w:spacing w:after="0"/>
+      </w:pPr>
+      <w:r>
+        <w:t>==================================================</w:t>
+      </w:r>
+    </w:p>
+    <w:p>
+      <w:pPr>
+        <w:spacing w:after="0"/>
+      </w:pPr>
+      <w:r>
+        <w:t>DEFAULT CELL TEMPLATE</w:t>
+      </w:r>
+    </w:p>
+    <w:p>
+      <w:pPr>
+        <w:spacing w:after="0"/>
+      </w:pPr>
+      <w:r>
+        <w:t>==================================================</w:t>
+      </w:r>
+    </w:p>
+    <w:p>
+      <w:pPr/>
+    </w:p>
+    <w:p>
+      <w:pPr>
+        <w:spacing w:after="0"/>
+      </w:pPr>
+      <w:r>
+        <w:t>Unless the biology clearly requires another arrangement, represent the RCD as ONE large simplified cell occupying approximately 70–85% of the canvas.</w:t>
+      </w:r>
+    </w:p>
+    <w:p>
+      <w:pPr/>
+    </w:p>
+    <w:p>
+      <w:pPr>
+        <w:spacing w:after="0"/>
+      </w:pPr>
+      <w:r>
+        <w:t>The default cell should have:</w:t>
+      </w:r>
+    </w:p>
+    <w:p>
+      <w:pPr/>
+    </w:p>
+    <w:p>
+      <w:pPr>
+        <w:spacing w:after="0"/>
+      </w:pPr>
+      <w:r>
+        <w:t>- a large rounded, oval, or mildly irregular outer silhouette;</w:t>
+      </w:r>
+    </w:p>
+    <w:p>
+      <w:pPr>
+        <w:spacing w:after="0"/>
+      </w:pPr>
+      <w:r>
+        <w:t>- one thick continuous membrane outline;</w:t>
+      </w:r>
+    </w:p>
+    <w:p>
+      <w:pPr>
+        <w:spacing w:after="0"/>
+      </w:pPr>
+      <w:r>
+        <w:t>- one simple nucleus when biologically appropriate;</w:t>
+      </w:r>
+    </w:p>
+    <w:p>
+      <w:pPr>
+        <w:spacing w:after="0"/>
+      </w:pPr>
+      <w:r>
+        <w:t>- a few highly simplified intracellular structures;</w:t>
+      </w:r>
+    </w:p>
+    <w:p>
+      <w:pPr>
+        <w:spacing w:after="0"/>
+      </w:pPr>
+      <w:r>
+        <w:t>- sparse small circular cytoplasmic dots when useful;</w:t>
+      </w:r>
+    </w:p>
+    <w:p>
+      <w:pPr>
+        <w:spacing w:after="0"/>
+      </w:pPr>
+      <w:r>
+        <w:t>- approximately two simplified mitochondria when appropriate;</w:t>
+      </w:r>
+    </w:p>
+    <w:p>
+      <w:pPr>
+        <w:spacing w:after="0"/>
+      </w:pPr>
+      <w:r>
+        <w:t>- several broad curved ER-like bars around the nucleus when appropriate.</w:t>
+      </w:r>
+    </w:p>
+    <w:p>
+      <w:pPr/>
+    </w:p>
+    <w:p>
+      <w:pPr>
+        <w:spacing w:after="0"/>
+      </w:pPr>
+      <w:r>
+        <w:t>Internal organelles are SECONDARY visual elements.</w:t>
+      </w:r>
+    </w:p>
+    <w:p>
+      <w:pPr/>
+    </w:p>
+    <w:p>
+      <w:pPr>
+        <w:spacing w:after="0"/>
+      </w:pPr>
+      <w:r>
+        <w:t>They should be subtle and simplified rather than competing with the defining RCD feature.</w:t>
+      </w:r>
+    </w:p>
+    <w:p>
+      <w:pPr/>
+    </w:p>
+    <w:p>
+      <w:pPr>
+        <w:spacing w:after="0"/>
+      </w:pPr>
+      <w:r>
+        <w:t>Do NOT automatically add every organelle.</w:t>
+      </w:r>
+    </w:p>
+    <w:p>
+      <w:pPr/>
+    </w:p>
+    <w:p>
+      <w:pPr>
+        <w:spacing w:after="0"/>
+      </w:pPr>
+      <w:r>
+        <w:t>==================================================</w:t>
+      </w:r>
+    </w:p>
+    <w:p>
+      <w:pPr>
+        <w:spacing w:after="0"/>
+      </w:pPr>
+      <w:r>
+        <w:t>PATHWAY-SPECIFIC MORPHOLOGY</w:t>
+      </w:r>
+    </w:p>
+    <w:p>
+      <w:pPr>
+        <w:spacing w:after="0"/>
+      </w:pPr>
+      <w:r>
+        <w:t>==================================================</w:t>
+      </w:r>
+    </w:p>
+    <w:p>
+      <w:pPr/>
+    </w:p>
+    <w:p>
+      <w:pPr>
+        <w:spacing w:after="0"/>
+      </w:pPr>
+      <w:r>
+        <w:t>Read the supplied biological description and identify the SINGLE most characteristic morphological, structural, or cellular event of this RCD.</w:t>
+      </w:r>
+    </w:p>
+    <w:p>
+      <w:pPr/>
+    </w:p>
+    <w:p>
+      <w:pPr>
+        <w:spacing w:after="0"/>
+      </w:pPr>
+      <w:r>
+        <w:t>Modify the default cell template only as much as necessary to express that event.</w:t>
+      </w:r>
+    </w:p>
+    <w:p>
+      <w:pPr/>
+    </w:p>
+    <w:p>
+      <w:pPr>
+        <w:spacing w:after="0"/>
+      </w:pPr>
+      <w:r>
+        <w:t>Possible changes include, only when supported by the description:</w:t>
+      </w:r>
+    </w:p>
+    <w:p>
+      <w:pPr/>
+    </w:p>
+    <w:p>
+      <w:pPr>
+        <w:spacing w:after="0"/>
+      </w:pPr>
+      <w:r>
+        <w:t>- swelling;</w:t>
+      </w:r>
+    </w:p>
+    <w:p>
+      <w:pPr>
+        <w:spacing w:after="0"/>
+      </w:pPr>
+      <w:r>
+        <w:t>- shrinkage;</w:t>
+      </w:r>
+    </w:p>
+    <w:p>
+      <w:pPr>
+        <w:spacing w:after="0"/>
+      </w:pPr>
+      <w:r>
+        <w:t>- irregular contour;</w:t>
+      </w:r>
+    </w:p>
+    <w:p>
+      <w:pPr>
+        <w:spacing w:after="0"/>
+      </w:pPr>
+      <w:r>
+        <w:t>- membrane rupture;</w:t>
+      </w:r>
+    </w:p>
+    <w:p>
+      <w:pPr>
+        <w:spacing w:after="0"/>
+      </w:pPr>
+      <w:r>
+        <w:t>- membrane discontinuity;</w:t>
+      </w:r>
+    </w:p>
+    <w:p>
+      <w:pPr>
+        <w:spacing w:after="0"/>
+      </w:pPr>
+      <w:r>
+        <w:t>- blebbing;</w:t>
+      </w:r>
+    </w:p>
+    <w:p>
+      <w:pPr>
+        <w:spacing w:after="0"/>
+      </w:pPr>
+      <w:r>
+        <w:t>- fragmentation;</w:t>
+      </w:r>
+    </w:p>
+    <w:p>
+      <w:pPr>
+        <w:spacing w:after="0"/>
+      </w:pPr>
+      <w:r>
+        <w:t>- vacuolization;</w:t>
+      </w:r>
+    </w:p>
+    <w:p>
+      <w:pPr>
+        <w:spacing w:after="0"/>
+      </w:pPr>
+      <w:r>
+        <w:t>- organelle alteration;</w:t>
+      </w:r>
+    </w:p>
+    <w:p>
+      <w:pPr>
+        <w:spacing w:after="0"/>
+      </w:pPr>
+      <w:r>
+        <w:t>- nuclear alteration;</w:t>
+      </w:r>
+    </w:p>
+    <w:p>
+      <w:pPr>
+        <w:spacing w:after="0"/>
+      </w:pPr>
+      <w:r>
+        <w:t>- extrusion;</w:t>
+      </w:r>
+    </w:p>
+    <w:p>
+      <w:pPr>
+        <w:spacing w:after="0"/>
+      </w:pPr>
+      <w:r>
+        <w:t>- engulfment;</w:t>
+      </w:r>
+    </w:p>
+    <w:p>
+      <w:pPr>
+        <w:spacing w:after="0"/>
+      </w:pPr>
+      <w:r>
+        <w:t>- cell-in-cell formation;</w:t>
+      </w:r>
+    </w:p>
+    <w:p>
+      <w:pPr>
+        <w:spacing w:after="0"/>
+      </w:pPr>
+      <w:r>
+        <w:t>- extracellular release;</w:t>
+      </w:r>
+    </w:p>
+    <w:p>
+      <w:pPr>
+        <w:spacing w:after="0"/>
+      </w:pPr>
+      <w:r>
+        <w:t>- DNA/chromatin release;</w:t>
+      </w:r>
+    </w:p>
+    <w:p>
+      <w:pPr>
+        <w:spacing w:after="0"/>
+      </w:pPr>
+      <w:r>
+        <w:t>- detached fragments;</w:t>
+      </w:r>
+    </w:p>
+    <w:p>
+      <w:pPr>
+        <w:spacing w:after="0"/>
+      </w:pPr>
+      <w:r>
+        <w:t>- loss of membrane integrity;</w:t>
+      </w:r>
+    </w:p>
+    <w:p>
+      <w:pPr>
+        <w:spacing w:after="0"/>
+      </w:pPr>
+      <w:r>
+        <w:t>- accumulation of a specific cellular compartment.</w:t>
+      </w:r>
+    </w:p>
+    <w:p>
+      <w:pPr/>
+    </w:p>
+    <w:p>
+      <w:pPr>
+        <w:spacing w:after="0"/>
+      </w:pPr>
+      <w:r>
+        <w:t>The defining event must be immediately visible.</w:t>
+      </w:r>
+    </w:p>
+    <w:p>
+      <w:pPr/>
+    </w:p>
+    <w:p>
+      <w:pPr>
+        <w:spacing w:after="0"/>
+      </w:pPr>
+      <w:r>
+        <w:t>However, preserve the SAME simplified visual language used for the rest of the collection.</w:t>
+      </w:r>
+    </w:p>
+    <w:p>
+      <w:pPr/>
+    </w:p>
+    <w:p>
+      <w:pPr>
+        <w:spacing w:after="0"/>
+      </w:pPr>
+      <w:r>
+        <w:t>==================================================</w:t>
+      </w:r>
+    </w:p>
+    <w:p>
+      <w:pPr>
+        <w:spacing w:after="0"/>
+      </w:pPr>
+      <w:r>
+        <w:t>EXCEPTION TO THE ONE-CELL TEMPLATE</w:t>
+      </w:r>
+    </w:p>
+    <w:p>
+      <w:pPr>
+        <w:spacing w:after="0"/>
+      </w:pPr>
+      <w:r>
+        <w:t>==================================================</w:t>
+      </w:r>
+    </w:p>
+    <w:p>
+      <w:pPr/>
+    </w:p>
+    <w:p>
+      <w:pPr>
+        <w:spacing w:after="0"/>
+      </w:pPr>
+      <w:r>
+        <w:t>Use more than one cell, extensive extracellular material, or an unusual composition ONLY when the defining biology cannot be communicated correctly with one cell.</w:t>
+      </w:r>
+    </w:p>
+    <w:p>
+      <w:pPr/>
+    </w:p>
+    <w:p>
+      <w:pPr>
+        <w:spacing w:after="0"/>
+      </w:pPr>
+      <w:r>
+        <w:t>Examples include processes involving:</w:t>
+      </w:r>
+    </w:p>
+    <w:p>
+      <w:pPr/>
+    </w:p>
+    <w:p>
+      <w:pPr>
+        <w:spacing w:after="0"/>
+      </w:pPr>
+      <w:r>
+        <w:t>- cell-in-cell structures;</w:t>
+      </w:r>
+    </w:p>
+    <w:p>
+      <w:pPr>
+        <w:spacing w:after="0"/>
+      </w:pPr>
+      <w:r>
+        <w:t>- engulfment;</w:t>
+      </w:r>
+    </w:p>
+    <w:p>
+      <w:pPr>
+        <w:spacing w:after="0"/>
+      </w:pPr>
+      <w:r>
+        <w:t>- phagocytosis/efferocytosis;</w:t>
+      </w:r>
+    </w:p>
+    <w:p>
+      <w:pPr>
+        <w:spacing w:after="0"/>
+      </w:pPr>
+      <w:r>
+        <w:t>- extrusion of extracellular chromatin;</w:t>
+      </w:r>
+    </w:p>
+    <w:p>
+      <w:pPr>
+        <w:spacing w:after="0"/>
+      </w:pPr>
+      <w:r>
+        <w:t>- interaction between two cells;</w:t>
+      </w:r>
+    </w:p>
+    <w:p>
+      <w:pPr>
+        <w:spacing w:after="0"/>
+      </w:pPr>
+      <w:r>
+        <w:t>- massive release of cellular material.</w:t>
+      </w:r>
+    </w:p>
+    <w:p>
+      <w:pPr/>
+    </w:p>
+    <w:p>
+      <w:pPr>
+        <w:spacing w:after="0"/>
+      </w:pPr>
+      <w:r>
+        <w:t>Even in these cases, preserve the exact same flat, rounded, simplified cartoon-like visual grammar.</w:t>
+      </w:r>
+    </w:p>
+    <w:p>
+      <w:pPr/>
+    </w:p>
+    <w:p>
+      <w:pPr>
+        <w:spacing w:after="0"/>
+      </w:pPr>
+      <w:r>
+        <w:t>Do NOT transform the image into a mechanistic diagram.</w:t>
+      </w:r>
+    </w:p>
+    <w:p>
+      <w:pPr/>
+    </w:p>
+    <w:p>
+      <w:pPr>
+        <w:spacing w:after="0"/>
+      </w:pPr>
+      <w:r>
+        <w:t>==================================================</w:t>
+      </w:r>
+    </w:p>
+    <w:p>
+      <w:pPr>
+        <w:spacing w:after="0"/>
+      </w:pPr>
+      <w:r>
+        <w:t>COLOR LANGUAGE</w:t>
+      </w:r>
+    </w:p>
+    <w:p>
+      <w:pPr>
+        <w:spacing w:after="0"/>
+      </w:pPr>
+      <w:r>
+        <w:t>==================================================</w:t>
+      </w:r>
+    </w:p>
+    <w:p>
+      <w:pPr/>
+    </w:p>
+    <w:p>
+      <w:pPr>
+        <w:spacing w:after="0"/>
+      </w:pPr>
+      <w:r>
+        <w:t>Color may vary between RCD modalities.</w:t>
+      </w:r>
+    </w:p>
+    <w:p>
+      <w:pPr/>
+    </w:p>
+    <w:p>
+      <w:pPr>
+        <w:spacing w:after="0"/>
+      </w:pPr>
+      <w:r>
+        <w:t>Do NOT force all icons to use the same color.</w:t>
+      </w:r>
+    </w:p>
+    <w:p>
+      <w:pPr/>
+    </w:p>
+    <w:p>
+      <w:pPr>
+        <w:spacing w:after="0"/>
+      </w:pPr>
+      <w:r>
+        <w:t>Choose a visually distinctive dominant color family appropriate for THIS icon.</w:t>
+      </w:r>
+    </w:p>
+    <w:p>
+      <w:pPr/>
+    </w:p>
+    <w:p>
+      <w:pPr>
+        <w:spacing w:after="0"/>
+      </w:pPr>
+      <w:r>
+        <w:t>Examples may include:</w:t>
+      </w:r>
+    </w:p>
+    <w:p>
+      <w:pPr/>
+    </w:p>
+    <w:p>
+      <w:pPr>
+        <w:spacing w:after="0"/>
+      </w:pPr>
+      <w:r>
+        <w:t>blue,</w:t>
+      </w:r>
+    </w:p>
+    <w:p>
+      <w:pPr>
+        <w:spacing w:after="0"/>
+      </w:pPr>
+      <w:r>
+        <w:t>teal,</w:t>
+      </w:r>
+    </w:p>
+    <w:p>
+      <w:pPr>
+        <w:spacing w:after="0"/>
+      </w:pPr>
+      <w:r>
+        <w:t>green,</w:t>
+      </w:r>
+    </w:p>
+    <w:p>
+      <w:pPr>
+        <w:spacing w:after="0"/>
+      </w:pPr>
+      <w:r>
+        <w:t>yellow,</w:t>
+      </w:r>
+    </w:p>
+    <w:p>
+      <w:pPr>
+        <w:spacing w:after="0"/>
+      </w:pPr>
+      <w:r>
+        <w:t>orange,</w:t>
+      </w:r>
+    </w:p>
+    <w:p>
+      <w:pPr>
+        <w:spacing w:after="0"/>
+      </w:pPr>
+      <w:r>
+        <w:t>brown,</w:t>
+      </w:r>
+    </w:p>
+    <w:p>
+      <w:pPr>
+        <w:spacing w:after="0"/>
+      </w:pPr>
+      <w:r>
+        <w:t>red,</w:t>
+      </w:r>
+    </w:p>
+    <w:p>
+      <w:pPr>
+        <w:spacing w:after="0"/>
+      </w:pPr>
+      <w:r>
+        <w:t>pink,</w:t>
+      </w:r>
+    </w:p>
+    <w:p>
+      <w:pPr>
+        <w:spacing w:after="0"/>
+      </w:pPr>
+      <w:r>
+        <w:t>magenta,</w:t>
+      </w:r>
+    </w:p>
+    <w:p>
+      <w:pPr>
+        <w:spacing w:after="0"/>
+      </w:pPr>
+      <w:r>
+        <w:t>purple,</w:t>
+      </w:r>
+    </w:p>
+    <w:p>
+      <w:pPr>
+        <w:spacing w:after="0"/>
+      </w:pPr>
+      <w:r>
+        <w:t>gray,</w:t>
+      </w:r>
+    </w:p>
+    <w:p>
+      <w:pPr>
+        <w:spacing w:after="0"/>
+      </w:pPr>
+      <w:r>
+        <w:t>or another restrained scientific color.</w:t>
+      </w:r>
+    </w:p>
+    <w:p>
+      <w:pPr/>
+    </w:p>
+    <w:p>
+      <w:pPr>
+        <w:spacing w:after="0"/>
+      </w:pPr>
+      <w:r>
+        <w:t>The icon may be:</w:t>
+      </w:r>
+    </w:p>
+    <w:p>
+      <w:pPr/>
+    </w:p>
+    <w:p>
+      <w:pPr>
+        <w:spacing w:after="0"/>
+      </w:pPr>
+      <w:r>
+        <w:t>- predominantly monochromatic with several related tonal values; OR</w:t>
+      </w:r>
+    </w:p>
+    <w:p>
+      <w:pPr>
+        <w:spacing w:after="0"/>
+      </w:pPr>
+      <w:r>
+        <w:t>- use 2–3 harmonious colors when biologically useful.</w:t>
+      </w:r>
+    </w:p>
+    <w:p>
+      <w:pPr/>
+    </w:p>
+    <w:p>
+      <w:pPr>
+        <w:spacing w:after="0"/>
+      </w:pPr>
+      <w:r>
+        <w:t>Prefer ONE dominant color family.</w:t>
+      </w:r>
+    </w:p>
+    <w:p>
+      <w:pPr/>
+    </w:p>
+    <w:p>
+      <w:pPr>
+        <w:spacing w:after="0"/>
+      </w:pPr>
+      <w:r>
+        <w:t>Use additional contrasting colors only when necessary to distinguish an important pathway-specific structure or event.</w:t>
+      </w:r>
+    </w:p>
+    <w:p>
+      <w:pPr/>
+    </w:p>
+    <w:p>
+      <w:pPr>
+        <w:spacing w:after="0"/>
+      </w:pPr>
+      <w:r>
+        <w:t>Do NOT create a highly multicolored illustration.</w:t>
+      </w:r>
+    </w:p>
+    <w:p>
+      <w:pPr/>
+    </w:p>
+    <w:p>
+      <w:pPr>
+        <w:spacing w:after="0"/>
+      </w:pPr>
+      <w:r>
+        <w:t>The cell body, nucleus, ER, mitochondria, particles and other structures should usually be rendered as tonal variations of the dominant palette.</w:t>
+      </w:r>
+    </w:p>
+    <w:p>
+      <w:pPr/>
+    </w:p>
+    <w:p>
+      <w:pPr>
+        <w:spacing w:after="0"/>
+      </w:pPr>
+      <w:r>
+        <w:t>Outlines must always be a darker, more saturated version of the corresponding fill.</w:t>
+      </w:r>
+    </w:p>
+    <w:p>
+      <w:pPr/>
+    </w:p>
+    <w:p>
+      <w:pPr>
+        <w:spacing w:after="0"/>
+      </w:pPr>
+      <w:r>
+        <w:t>Never use pure black outlines.</w:t>
+      </w:r>
+    </w:p>
+    <w:p>
+      <w:pPr/>
+    </w:p>
+    <w:p>
+      <w:pPr>
+        <w:spacing w:after="0"/>
+      </w:pPr>
+      <w:r>
+        <w:t>==================================================</w:t>
+      </w:r>
+    </w:p>
+    <w:p>
+      <w:pPr>
+        <w:spacing w:after="0"/>
+      </w:pPr>
+      <w:r>
+        <w:t>OUTLINE AND SHAPE STYLE</w:t>
+      </w:r>
+    </w:p>
+    <w:p>
+      <w:pPr>
+        <w:spacing w:after="0"/>
+      </w:pPr>
+      <w:r>
+        <w:t>==================================================</w:t>
+      </w:r>
+    </w:p>
+    <w:p>
+      <w:pPr/>
+    </w:p>
+    <w:p>
+      <w:pPr>
+        <w:spacing w:after="0"/>
+      </w:pPr>
+      <w:r>
+        <w:t>Use a clearly visible thick outer contour.</w:t>
+      </w:r>
+    </w:p>
+    <w:p>
+      <w:pPr/>
+    </w:p>
+    <w:p>
+      <w:pPr>
+        <w:spacing w:after="0"/>
+      </w:pPr>
+      <w:r>
+        <w:t>The outer contour should be approximately 1.5–2.5% of the main cell width.</w:t>
+      </w:r>
+    </w:p>
+    <w:p>
+      <w:pPr/>
+    </w:p>
+    <w:p>
+      <w:pPr>
+        <w:spacing w:after="0"/>
+      </w:pPr>
+      <w:r>
+        <w:t>Use smooth rounded curves.</w:t>
+      </w:r>
+    </w:p>
+    <w:p>
+      <w:pPr/>
+    </w:p>
+    <w:p>
+      <w:pPr>
+        <w:spacing w:after="0"/>
+      </w:pPr>
+      <w:r>
+        <w:t>Internal structures should use the same rounded visual language.</w:t>
+      </w:r>
+    </w:p>
+    <w:p>
+      <w:pPr/>
+    </w:p>
+    <w:p>
+      <w:pPr>
+        <w:spacing w:after="0"/>
+      </w:pPr>
+      <w:r>
+        <w:t>Avoid:</w:t>
+      </w:r>
+    </w:p>
+    <w:p>
+      <w:pPr>
+        <w:spacing w:after="0"/>
+      </w:pPr>
+      <w:r>
+        <w:t>- delicate linework;</w:t>
+      </w:r>
+    </w:p>
+    <w:p>
+      <w:pPr>
+        <w:spacing w:after="0"/>
+      </w:pPr>
+      <w:r>
+        <w:t>- thin technical lines;</w:t>
+      </w:r>
+    </w:p>
+    <w:p>
+      <w:pPr>
+        <w:spacing w:after="0"/>
+      </w:pPr>
+      <w:r>
+        <w:t>- realistic membranes;</w:t>
+      </w:r>
+    </w:p>
+    <w:p>
+      <w:pPr>
+        <w:spacing w:after="0"/>
+      </w:pPr>
+      <w:r>
+        <w:t>- complex bilayers;</w:t>
+      </w:r>
+    </w:p>
+    <w:p>
+      <w:pPr>
+        <w:spacing w:after="0"/>
+      </w:pPr>
+      <w:r>
+        <w:t>- excessive nested borders;</w:t>
+      </w:r>
+    </w:p>
+    <w:p>
+      <w:pPr>
+        <w:spacing w:after="0"/>
+      </w:pPr>
+      <w:r>
+        <w:t>- sharp geometric shapes unless biologically necessary.</w:t>
+      </w:r>
+    </w:p>
+    <w:p>
+      <w:pPr/>
+    </w:p>
+    <w:p>
+      <w:pPr>
+        <w:spacing w:after="0"/>
+      </w:pPr>
+      <w:r>
+        <w:t>==================================================</w:t>
+      </w:r>
+    </w:p>
+    <w:p>
+      <w:pPr>
+        <w:spacing w:after="0"/>
+      </w:pPr>
+      <w:r>
+        <w:t>NUCLEUS</w:t>
+      </w:r>
+    </w:p>
+    <w:p>
+      <w:pPr>
+        <w:spacing w:after="0"/>
+      </w:pPr>
+      <w:r>
+        <w:t>==================================================</w:t>
+      </w:r>
+    </w:p>
+    <w:p>
+      <w:pPr/>
+    </w:p>
+    <w:p>
+      <w:pPr>
+        <w:spacing w:after="0"/>
+      </w:pPr>
+      <w:r>
+        <w:t>When present, the nucleus should be:</w:t>
+      </w:r>
+    </w:p>
+    <w:p>
+      <w:pPr/>
+    </w:p>
+    <w:p>
+      <w:pPr>
+        <w:spacing w:after="0"/>
+      </w:pPr>
+      <w:r>
+        <w:t>- one large simple circle, oval, or softly irregular shape;</w:t>
+      </w:r>
+    </w:p>
+    <w:p>
+      <w:pPr>
+        <w:spacing w:after="0"/>
+      </w:pPr>
+      <w:r>
+        <w:t>- filled with a darker or lighter tone from the same palette;</w:t>
+      </w:r>
+    </w:p>
+    <w:p>
+      <w:pPr>
+        <w:spacing w:after="0"/>
+      </w:pPr>
+      <w:r>
+        <w:t>- surrounded by one simple outline.</w:t>
+      </w:r>
+    </w:p>
+    <w:p>
+      <w:pPr/>
+    </w:p>
+    <w:p>
+      <w:pPr>
+        <w:spacing w:after="0"/>
+      </w:pPr>
+      <w:r>
+        <w:t>Do NOT draw chromatin detail unless nuclear alteration is itself the defining feature.</w:t>
+      </w:r>
+    </w:p>
+    <w:p>
+      <w:pPr/>
+    </w:p>
+    <w:p>
+      <w:pPr>
+        <w:spacing w:after="0"/>
+      </w:pPr>
+      <w:r>
+        <w:t>==================================================</w:t>
+      </w:r>
+    </w:p>
+    <w:p>
+      <w:pPr>
+        <w:spacing w:after="0"/>
+      </w:pPr>
+      <w:r>
+        <w:t>MITOCHONDRIA</w:t>
+      </w:r>
+    </w:p>
+    <w:p>
+      <w:pPr>
+        <w:spacing w:after="0"/>
+      </w:pPr>
+      <w:r>
+        <w:t>==================================================</w:t>
+      </w:r>
+    </w:p>
+    <w:p>
+      <w:pPr/>
+    </w:p>
+    <w:p>
+      <w:pPr>
+        <w:spacing w:after="0"/>
+      </w:pPr>
+      <w:r>
+        <w:t>When mitochondria are present as background organelles:</w:t>
+      </w:r>
+    </w:p>
+    <w:p>
+      <w:pPr/>
+    </w:p>
+    <w:p>
+      <w:pPr>
+        <w:spacing w:after="0"/>
+      </w:pPr>
+      <w:r>
+        <w:t>- show only approximately 1–2;</w:t>
+      </w:r>
+    </w:p>
+    <w:p>
+      <w:pPr>
+        <w:spacing w:after="0"/>
+      </w:pPr>
+      <w:r>
+        <w:t>- use simple bean-shaped silhouettes;</w:t>
+      </w:r>
+    </w:p>
+    <w:p>
+      <w:pPr>
+        <w:spacing w:after="0"/>
+      </w:pPr>
+      <w:r>
+        <w:t>- use a few short rounded internal cristae;</w:t>
+      </w:r>
+    </w:p>
+    <w:p>
+      <w:pPr>
+        <w:spacing w:after="0"/>
+      </w:pPr>
+      <w:r>
+        <w:t>- keep them visually subtle and tone-on-tone.</w:t>
+      </w:r>
+    </w:p>
+    <w:p>
+      <w:pPr/>
+    </w:p>
+    <w:p>
+      <w:pPr>
+        <w:spacing w:after="0"/>
+      </w:pPr>
+      <w:r>
+        <w:t>If mitochondrial morphology is the defining feature of the pathway, it may become more prominent.</w:t>
+      </w:r>
+    </w:p>
+    <w:p>
+      <w:pPr/>
+    </w:p>
+    <w:p>
+      <w:pPr>
+        <w:spacing w:after="0"/>
+      </w:pPr>
+      <w:r>
+        <w:t>Do NOT create a detailed standalone mitochondrion unless absolutely required by the biological description.</w:t>
+      </w:r>
+    </w:p>
+    <w:p>
+      <w:pPr/>
+    </w:p>
+    <w:p>
+      <w:pPr>
+        <w:spacing w:after="0"/>
+      </w:pPr>
+      <w:r>
+        <w:t>==================================================</w:t>
+      </w:r>
+    </w:p>
+    <w:p>
+      <w:pPr>
+        <w:spacing w:after="0"/>
+      </w:pPr>
+      <w:r>
+        <w:t>ENDOPLASMIC RETICULUM</w:t>
+      </w:r>
+    </w:p>
+    <w:p>
+      <w:pPr>
+        <w:spacing w:after="0"/>
+      </w:pPr>
+      <w:r>
+        <w:t>==================================================</w:t>
+      </w:r>
+    </w:p>
+    <w:p>
+      <w:pPr/>
+    </w:p>
+    <w:p>
+      <w:pPr>
+        <w:spacing w:after="0"/>
+      </w:pPr>
+      <w:r>
+        <w:t>When appropriate, represent the ER as a few broad smooth curved bars arranged around part of the nucleus.</w:t>
+      </w:r>
+    </w:p>
+    <w:p>
+      <w:pPr/>
+    </w:p>
+    <w:p>
+      <w:pPr>
+        <w:spacing w:after="0"/>
+      </w:pPr>
+      <w:r>
+        <w:t>Use approximately 3–6 rounded segments.</w:t>
+      </w:r>
+    </w:p>
+    <w:p>
+      <w:pPr/>
+    </w:p>
+    <w:p>
+      <w:pPr>
+        <w:spacing w:after="0"/>
+      </w:pPr>
+      <w:r>
+        <w:t>Keep them tone-on-tone and visually secondary.</w:t>
+      </w:r>
+    </w:p>
+    <w:p>
+      <w:pPr/>
+    </w:p>
+    <w:p>
+      <w:pPr>
+        <w:spacing w:after="0"/>
+      </w:pPr>
+      <w:r>
+        <w:t>Do NOT draw realistic ER networks.</w:t>
+      </w:r>
+    </w:p>
+    <w:p>
+      <w:pPr/>
+    </w:p>
+    <w:p>
+      <w:pPr>
+        <w:spacing w:after="0"/>
+      </w:pPr>
+      <w:r>
+        <w:t>==================================================</w:t>
+      </w:r>
+    </w:p>
+    <w:p>
+      <w:pPr>
+        <w:spacing w:after="0"/>
+      </w:pPr>
+      <w:r>
+        <w:t>SMALL CYTOPLASMIC ELEMENTS</w:t>
+      </w:r>
+    </w:p>
+    <w:p>
+      <w:pPr>
+        <w:spacing w:after="0"/>
+      </w:pPr>
+      <w:r>
+        <w:t>==================================================</w:t>
+      </w:r>
+    </w:p>
+    <w:p>
+      <w:pPr/>
+    </w:p>
+    <w:p>
+      <w:pPr>
+        <w:spacing w:after="0"/>
+      </w:pPr>
+      <w:r>
+        <w:t>Small molecules, granules, vesicles or particles may be represented using a small number of:</w:t>
+      </w:r>
+    </w:p>
+    <w:p>
+      <w:pPr/>
+    </w:p>
+    <w:p>
+      <w:pPr>
+        <w:spacing w:after="0"/>
+      </w:pPr>
+      <w:r>
+        <w:t>- circles;</w:t>
+      </w:r>
+    </w:p>
+    <w:p>
+      <w:pPr>
+        <w:spacing w:after="0"/>
+      </w:pPr>
+      <w:r>
+        <w:t>- rounded dots;</w:t>
+      </w:r>
+    </w:p>
+    <w:p>
+      <w:pPr>
+        <w:spacing w:after="0"/>
+      </w:pPr>
+      <w:r>
+        <w:t>- simple blobs;</w:t>
+      </w:r>
+    </w:p>
+    <w:p>
+      <w:pPr>
+        <w:spacing w:after="0"/>
+      </w:pPr>
+      <w:r>
+        <w:t>- compact geometric shapes.</w:t>
+      </w:r>
+    </w:p>
+    <w:p>
+      <w:pPr/>
+    </w:p>
+    <w:p>
+      <w:pPr>
+        <w:spacing w:after="0"/>
+      </w:pPr>
+      <w:r>
+        <w:t>Use them sparingly.</w:t>
+      </w:r>
+    </w:p>
+    <w:p>
+      <w:pPr/>
+    </w:p>
+    <w:p>
+      <w:pPr>
+        <w:spacing w:after="0"/>
+      </w:pPr>
+      <w:r>
+        <w:t>They are decorative-supporting biological elements, not the main subject unless explicitly required by the pathway.</w:t>
+      </w:r>
+    </w:p>
+    <w:p>
+      <w:pPr/>
+    </w:p>
+    <w:p>
+      <w:pPr>
+        <w:spacing w:after="0"/>
+      </w:pPr>
+      <w:r>
+        <w:t>==================================================</w:t>
+      </w:r>
+    </w:p>
+    <w:p>
+      <w:pPr>
+        <w:spacing w:after="0"/>
+      </w:pPr>
+      <w:r>
+        <w:t>MEMBRANE DAMAGE OR CELL RUPTURE</w:t>
+      </w:r>
+    </w:p>
+    <w:p>
+      <w:pPr>
+        <w:spacing w:after="0"/>
+      </w:pPr>
+      <w:r>
+        <w:t>==================================================</w:t>
+      </w:r>
+    </w:p>
+    <w:p>
+      <w:pPr/>
+    </w:p>
+    <w:p>
+      <w:pPr>
+        <w:spacing w:after="0"/>
+      </w:pPr>
+      <w:r>
+        <w:t>When membrane integrity is lost:</w:t>
+      </w:r>
+    </w:p>
+    <w:p>
+      <w:pPr/>
+    </w:p>
+    <w:p>
+      <w:pPr>
+        <w:spacing w:after="0"/>
+      </w:pPr>
+      <w:r>
+        <w:t>- break the outer contour locally;</w:t>
+      </w:r>
+    </w:p>
+    <w:p>
+      <w:pPr>
+        <w:spacing w:after="0"/>
+      </w:pPr>
+      <w:r>
+        <w:t>- use a few simplified released fragments or soft extracellular blobs;</w:t>
+      </w:r>
+    </w:p>
+    <w:p>
+      <w:pPr>
+        <w:spacing w:after="0"/>
+      </w:pPr>
+      <w:r>
+        <w:t>- optionally use a dashed contour in damaged regions if appropriate;</w:t>
+      </w:r>
+    </w:p>
+    <w:p>
+      <w:pPr>
+        <w:spacing w:after="0"/>
+      </w:pPr>
+      <w:r>
+        <w:t>- preserve the same thick rounded line style.</w:t>
+      </w:r>
+    </w:p>
+    <w:p>
+      <w:pPr/>
+    </w:p>
+    <w:p>
+      <w:pPr>
+        <w:spacing w:after="0"/>
+      </w:pPr>
+      <w:r>
+        <w:t>Do NOT render realistic membrane debris.</w:t>
+      </w:r>
+    </w:p>
+    <w:p>
+      <w:pPr/>
+    </w:p>
+    <w:p>
+      <w:pPr>
+        <w:spacing w:after="0"/>
+      </w:pPr>
+      <w:r>
+        <w:t>Do NOT create explosive visual effects.</w:t>
+      </w:r>
+    </w:p>
+    <w:p>
+      <w:pPr/>
+    </w:p>
+    <w:p>
+      <w:pPr>
+        <w:spacing w:after="0"/>
+      </w:pPr>
+      <w:r>
+        <w:t>==================================================</w:t>
+      </w:r>
+    </w:p>
+    <w:p>
+      <w:pPr>
+        <w:spacing w:after="0"/>
+      </w:pPr>
+      <w:r>
+        <w:t>EXTRACELLULAR RELEASE</w:t>
+      </w:r>
+    </w:p>
+    <w:p>
+      <w:pPr>
+        <w:spacing w:after="0"/>
+      </w:pPr>
+      <w:r>
+        <w:t>==================================================</w:t>
+      </w:r>
+    </w:p>
+    <w:p>
+      <w:pPr/>
+    </w:p>
+    <w:p>
+      <w:pPr>
+        <w:spacing w:after="0"/>
+      </w:pPr>
+      <w:r>
+        <w:t>When cellular material is released:</w:t>
+      </w:r>
+    </w:p>
+    <w:p>
+      <w:pPr/>
+    </w:p>
+    <w:p>
+      <w:pPr>
+        <w:spacing w:after="0"/>
+      </w:pPr>
+      <w:r>
+        <w:t>- use broad soft pale shapes;</w:t>
+      </w:r>
+    </w:p>
+    <w:p>
+      <w:pPr>
+        <w:spacing w:after="0"/>
+      </w:pPr>
+      <w:r>
+        <w:t>- use only a limited number of fragments, dots, vesicles or strands;</w:t>
+      </w:r>
+    </w:p>
+    <w:p>
+      <w:pPr>
+        <w:spacing w:after="0"/>
+      </w:pPr>
+      <w:r>
+        <w:t>- maintain ample white space;</w:t>
+      </w:r>
+    </w:p>
+    <w:p>
+      <w:pPr>
+        <w:spacing w:after="0"/>
+      </w:pPr>
+      <w:r>
+        <w:t>- keep the composition clean.</w:t>
+      </w:r>
+    </w:p>
+    <w:p>
+      <w:pPr/>
+    </w:p>
+    <w:p>
+      <w:pPr>
+        <w:spacing w:after="0"/>
+      </w:pPr>
+      <w:r>
+        <w:t>For extracellular DNA or chromatin, use a few simple thin wavy strands only when biologically central.</w:t>
+      </w:r>
+    </w:p>
+    <w:p>
+      <w:pPr/>
+    </w:p>
+    <w:p>
+      <w:pPr>
+        <w:spacing w:after="0"/>
+      </w:pPr>
+      <w:r>
+        <w:t>==================================================</w:t>
+      </w:r>
+    </w:p>
+    <w:p>
+      <w:pPr>
+        <w:spacing w:after="0"/>
+      </w:pPr>
+      <w:r>
+        <w:t>VISUAL HIERARCHY</w:t>
+      </w:r>
+    </w:p>
+    <w:p>
+      <w:pPr>
+        <w:spacing w:after="0"/>
+      </w:pPr>
+      <w:r>
+        <w:t>==================================================</w:t>
+      </w:r>
+    </w:p>
+    <w:p>
+      <w:pPr/>
+    </w:p>
+    <w:p>
+      <w:pPr>
+        <w:spacing w:after="0"/>
+      </w:pPr>
+      <w:r>
+        <w:t>The illustration should contain:</w:t>
+      </w:r>
+    </w:p>
+    <w:p>
+      <w:pPr/>
+    </w:p>
+    <w:p>
+      <w:pPr>
+        <w:spacing w:after="0"/>
+      </w:pPr>
+      <w:r>
+        <w:t>1. ONE dominant cell or cellular event;</w:t>
+      </w:r>
+    </w:p>
+    <w:p>
+      <w:pPr>
+        <w:spacing w:after="0"/>
+      </w:pPr>
+      <w:r>
+        <w:t>2. ONE immediately recognizable RCD-specific morphological hallmark;</w:t>
+      </w:r>
+    </w:p>
+    <w:p>
+      <w:pPr>
+        <w:spacing w:after="0"/>
+      </w:pPr>
+      <w:r>
+        <w:t>3. only a few supporting structures.</w:t>
+      </w:r>
+    </w:p>
+    <w:p>
+      <w:pPr/>
+    </w:p>
+    <w:p>
+      <w:pPr>
+        <w:spacing w:after="0"/>
+      </w:pPr>
+      <w:r>
+        <w:t>The defining event must carry the identity of the pathway.</w:t>
+      </w:r>
+    </w:p>
+    <w:p>
+      <w:pPr/>
+    </w:p>
+    <w:p>
+      <w:pPr>
+        <w:spacing w:after="0"/>
+      </w:pPr>
+      <w:r>
+        <w:t>Background organelles must remain secondary.</w:t>
+      </w:r>
+    </w:p>
+    <w:p>
+      <w:pPr/>
+    </w:p>
+    <w:p>
+      <w:pPr>
+        <w:spacing w:after="0"/>
+      </w:pPr>
+      <w:r>
+        <w:t>Do NOT attempt to explain the complete signaling mechanism.</w:t>
+      </w:r>
+    </w:p>
+    <w:p>
+      <w:pPr/>
+    </w:p>
+    <w:p>
+      <w:pPr>
+        <w:spacing w:after="0"/>
+      </w:pPr>
+      <w:r>
+        <w:t>==================================================</w:t>
+      </w:r>
+    </w:p>
+    <w:p>
+      <w:pPr>
+        <w:spacing w:after="0"/>
+      </w:pPr>
+      <w:r>
+        <w:t>STRICTLY PROHIBITED</w:t>
+      </w:r>
+    </w:p>
+    <w:p>
+      <w:pPr>
+        <w:spacing w:after="0"/>
+      </w:pPr>
+      <w:r>
+        <w:t>==================================================</w:t>
+      </w:r>
+    </w:p>
+    <w:p>
+      <w:pPr/>
+    </w:p>
+    <w:p>
+      <w:pPr>
+        <w:spacing w:after="0"/>
+      </w:pPr>
+      <w:r>
+        <w:t>NO text.</w:t>
+      </w:r>
+    </w:p>
+    <w:p>
+      <w:pPr>
+        <w:spacing w:after="0"/>
+      </w:pPr>
+      <w:r>
+        <w:t>NO pathway name.</w:t>
+      </w:r>
+    </w:p>
+    <w:p>
+      <w:pPr>
+        <w:spacing w:after="0"/>
+      </w:pPr>
+      <w:r>
+        <w:t>NO protein names.</w:t>
+      </w:r>
+    </w:p>
+    <w:p>
+      <w:pPr>
+        <w:spacing w:after="0"/>
+      </w:pPr>
+      <w:r>
+        <w:t>NO gene names.</w:t>
+      </w:r>
+    </w:p>
+    <w:p>
+      <w:pPr>
+        <w:spacing w:after="0"/>
+      </w:pPr>
+      <w:r>
+        <w:t>NO chemical names.</w:t>
+      </w:r>
+    </w:p>
+    <w:p>
+      <w:pPr>
+        <w:spacing w:after="0"/>
+      </w:pPr>
+      <w:r>
+        <w:t>NO ion labels.</w:t>
+      </w:r>
+    </w:p>
+    <w:p>
+      <w:pPr>
+        <w:spacing w:after="0"/>
+      </w:pPr>
+      <w:r>
+        <w:t>NO abbreviations.</w:t>
+      </w:r>
+    </w:p>
+    <w:p>
+      <w:pPr>
+        <w:spacing w:after="0"/>
+      </w:pPr>
+      <w:r>
+        <w:t>NO NH3, Ca2+, ROS, ATP, DNA labels, etc.</w:t>
+      </w:r>
+    </w:p>
+    <w:p>
+      <w:pPr>
+        <w:spacing w:after="0"/>
+      </w:pPr>
+      <w:r>
+        <w:t>NO letters.</w:t>
+      </w:r>
+    </w:p>
+    <w:p>
+      <w:pPr>
+        <w:spacing w:after="0"/>
+      </w:pPr>
+      <w:r>
+        <w:t>NO numbers.</w:t>
+      </w:r>
+    </w:p>
+    <w:p>
+      <w:pPr>
+        <w:spacing w:after="0"/>
+      </w:pPr>
+      <w:r>
+        <w:t>NO legends.</w:t>
+      </w:r>
+    </w:p>
+    <w:p>
+      <w:pPr>
+        <w:spacing w:after="0"/>
+      </w:pPr>
+      <w:r>
+        <w:t>NO annotations.</w:t>
+      </w:r>
+    </w:p>
+    <w:p>
+      <w:pPr/>
+    </w:p>
+    <w:p>
+      <w:pPr>
+        <w:spacing w:after="0"/>
+      </w:pPr>
+      <w:r>
+        <w:t>NO arrows.</w:t>
+      </w:r>
+    </w:p>
+    <w:p>
+      <w:pPr>
+        <w:spacing w:after="0"/>
+      </w:pPr>
+      <w:r>
+        <w:t>NO arrowheads.</w:t>
+      </w:r>
+    </w:p>
+    <w:p>
+      <w:pPr>
+        <w:spacing w:after="0"/>
+      </w:pPr>
+      <w:r>
+        <w:t>NO cause-to-effect diagram.</w:t>
+      </w:r>
+    </w:p>
+    <w:p>
+      <w:pPr>
+        <w:spacing w:after="0"/>
+      </w:pPr>
+      <w:r>
+        <w:t>NO signaling pathway.</w:t>
+      </w:r>
+    </w:p>
+    <w:p>
+      <w:pPr>
+        <w:spacing w:after="0"/>
+      </w:pPr>
+      <w:r>
+        <w:t>NO flowchart.</w:t>
+      </w:r>
+    </w:p>
+    <w:p>
+      <w:pPr/>
+    </w:p>
+    <w:p>
+      <w:pPr>
+        <w:spacing w:after="0"/>
+      </w:pPr>
+      <w:r>
+        <w:t>NO isolated organelle connected to another structure by arrows.</w:t>
+      </w:r>
+    </w:p>
+    <w:p>
+      <w:pPr/>
+    </w:p>
+    <w:p>
+      <w:pPr>
+        <w:spacing w:after="0"/>
+      </w:pPr>
+      <w:r>
+        <w:t>NO realistic molecular structures.</w:t>
+      </w:r>
+    </w:p>
+    <w:p>
+      <w:pPr/>
+    </w:p>
+    <w:p>
+      <w:pPr>
+        <w:spacing w:after="0"/>
+      </w:pPr>
+      <w:r>
+        <w:t>NO detailed molecular interactions.</w:t>
+      </w:r>
+    </w:p>
+    <w:p>
+      <w:pPr/>
+    </w:p>
+    <w:p>
+      <w:pPr>
+        <w:spacing w:after="0"/>
+      </w:pPr>
+      <w:r>
+        <w:t>NO perspective.</w:t>
+      </w:r>
+    </w:p>
+    <w:p>
+      <w:pPr>
+        <w:spacing w:after="0"/>
+      </w:pPr>
+      <w:r>
+        <w:t>NO tilted cells.</w:t>
+      </w:r>
+    </w:p>
+    <w:p>
+      <w:pPr>
+        <w:spacing w:after="0"/>
+      </w:pPr>
+      <w:r>
+        <w:t>NO isometric illustration.</w:t>
+      </w:r>
+    </w:p>
+    <w:p>
+      <w:pPr>
+        <w:spacing w:after="0"/>
+      </w:pPr>
+      <w:r>
+        <w:t>NO 3D organelles.</w:t>
+      </w:r>
+    </w:p>
+    <w:p>
+      <w:pPr>
+        <w:spacing w:after="0"/>
+      </w:pPr>
+      <w:r>
+        <w:t>NO depth.</w:t>
+      </w:r>
+    </w:p>
+    <w:p>
+      <w:pPr>
+        <w:spacing w:after="0"/>
+      </w:pPr>
+      <w:r>
+        <w:t>NO gradients.</w:t>
+      </w:r>
+    </w:p>
+    <w:p>
+      <w:pPr>
+        <w:spacing w:after="0"/>
+      </w:pPr>
+      <w:r>
+        <w:t>NO shadows.</w:t>
+      </w:r>
+    </w:p>
+    <w:p>
+      <w:pPr>
+        <w:spacing w:after="0"/>
+      </w:pPr>
+      <w:r>
+        <w:t>NO highlights.</w:t>
+      </w:r>
+    </w:p>
+    <w:p>
+      <w:pPr>
+        <w:spacing w:after="0"/>
+      </w:pPr>
+      <w:r>
+        <w:t>NO gloss.</w:t>
+      </w:r>
+    </w:p>
+    <w:p>
+      <w:pPr>
+        <w:spacing w:after="0"/>
+      </w:pPr>
+      <w:r>
+        <w:t>NO texture.</w:t>
+      </w:r>
+    </w:p>
+    <w:p>
+      <w:pPr>
+        <w:spacing w:after="0"/>
+      </w:pPr>
+      <w:r>
+        <w:t>NO photorealism.</w:t>
+      </w:r>
+    </w:p>
+    <w:p>
+      <w:pPr/>
+    </w:p>
+    <w:p>
+      <w:pPr>
+        <w:spacing w:after="0"/>
+      </w:pPr>
+      <w:r>
+        <w:t>NO decorative elements unrelated to the biological description.</w:t>
+      </w:r>
+    </w:p>
+    <w:p>
+      <w:pPr/>
+    </w:p>
+    <w:p>
+      <w:pPr>
+        <w:spacing w:after="0"/>
+      </w:pPr>
+      <w:r>
+        <w:t>==================================================</w:t>
+      </w:r>
+    </w:p>
+    <w:p>
+      <w:pPr>
+        <w:spacing w:after="0"/>
+      </w:pPr>
+      <w:r>
+        <w:t>SCIENTIFIC INTERPRETATION</w:t>
+      </w:r>
+    </w:p>
+    <w:p>
+      <w:pPr>
+        <w:spacing w:after="0"/>
+      </w:pPr>
+      <w:r>
+        <w:t>==================================================</w:t>
+      </w:r>
+    </w:p>
+    <w:p>
+      <w:pPr/>
+    </w:p>
+    <w:p>
+      <w:pPr>
+        <w:spacing w:after="0"/>
+      </w:pPr>
+      <w:r>
+        <w:t>Use ONLY the information contained in the supplied RCD description.</w:t>
+      </w:r>
+    </w:p>
+    <w:p>
+      <w:pPr/>
+    </w:p>
+    <w:p>
+      <w:pPr>
+        <w:spacing w:after="0"/>
+      </w:pPr>
+      <w:r>
+        <w:t>Do not invent morphological characteristics.</w:t>
+      </w:r>
+    </w:p>
+    <w:p>
+      <w:pPr/>
+    </w:p>
+    <w:p>
+      <w:pPr>
+        <w:spacing w:after="0"/>
+      </w:pPr>
+      <w:r>
+        <w:t>If the description contains many molecular mechanisms but only one characteristic cellular phenotype, represent the CELLULAR PHENOTYPE rather than attempting to draw all molecular mechanisms.</w:t>
+      </w:r>
+    </w:p>
+    <w:p>
+      <w:pPr/>
+    </w:p>
+    <w:p>
+      <w:pPr>
+        <w:spacing w:after="0"/>
+      </w:pPr>
+      <w:r>
+        <w:t>If no unique morphology is described, choose the simplest cellular representation of the most distinctive biological event.</w:t>
+      </w:r>
+    </w:p>
+    <w:p>
+      <w:pPr/>
+    </w:p>
+    <w:p>
+      <w:pPr>
+        <w:spacing w:after="0"/>
+      </w:pPr>
+      <w:r>
+        <w:t>Translate molecular mechanisms into visible cellular consequences whenever scientifically justified.</w:t>
+      </w:r>
+    </w:p>
+    <w:p>
+      <w:pPr/>
+    </w:p>
+    <w:p>
+      <w:pPr>
+        <w:spacing w:after="0"/>
+      </w:pPr>
+      <w:r>
+        <w:t>For example:</w:t>
+      </w:r>
+    </w:p>
+    <w:p>
+      <w:pPr/>
+    </w:p>
+    <w:p>
+      <w:pPr>
+        <w:spacing w:after="0"/>
+      </w:pPr>
+      <w:r>
+        <w:t>a molecular alteration should NOT automatically be represented by labeled molecules and arrows.</w:t>
+      </w:r>
+    </w:p>
+    <w:p>
+      <w:pPr/>
+    </w:p>
+    <w:p>
+      <w:pPr>
+        <w:spacing w:after="0"/>
+      </w:pPr>
+      <w:r>
+        <w:t>Instead, represent the cellular or organellar state produced by that alteration when supported by the description.</w:t>
+      </w:r>
+    </w:p>
+    <w:p>
+      <w:pPr/>
+    </w:p>
+    <w:p>
+      <w:pPr>
+        <w:spacing w:after="0"/>
+      </w:pPr>
+      <w:r>
+        <w:t>==================================================</w:t>
+      </w:r>
+    </w:p>
+    <w:p>
+      <w:pPr>
+        <w:spacing w:after="0"/>
+      </w:pPr>
+      <w:r>
+        <w:t>SERIES CONSISTENCY</w:t>
+      </w:r>
+    </w:p>
+    <w:p>
+      <w:pPr>
+        <w:spacing w:after="0"/>
+      </w:pPr>
+      <w:r>
+        <w:t>==================================================</w:t>
+      </w:r>
+    </w:p>
+    <w:p>
+      <w:pPr/>
+    </w:p>
+    <w:p>
+      <w:pPr>
+        <w:spacing w:after="0"/>
+      </w:pPr>
+      <w:r>
+        <w:t>Imagine that this icon will appear directly beside dozens of other RCD icons.</w:t>
+      </w:r>
+    </w:p>
+    <w:p>
+      <w:pPr/>
+    </w:p>
+    <w:p>
+      <w:pPr>
+        <w:spacing w:after="0"/>
+      </w:pPr>
+      <w:r>
+        <w:t>It must have the same:</w:t>
+      </w:r>
+    </w:p>
+    <w:p>
+      <w:pPr/>
+    </w:p>
+    <w:p>
+      <w:pPr>
+        <w:spacing w:after="0"/>
+      </w:pPr>
+      <w:r>
+        <w:t>- line thickness;</w:t>
+      </w:r>
+    </w:p>
+    <w:p>
+      <w:pPr>
+        <w:spacing w:after="0"/>
+      </w:pPr>
+      <w:r>
+        <w:t>- degree of simplification;</w:t>
+      </w:r>
+    </w:p>
+    <w:p>
+      <w:pPr>
+        <w:spacing w:after="0"/>
+      </w:pPr>
+      <w:r>
+        <w:t>- cartoon-like softness;</w:t>
+      </w:r>
+    </w:p>
+    <w:p>
+      <w:pPr>
+        <w:spacing w:after="0"/>
+      </w:pPr>
+      <w:r>
+        <w:t>- organelle abstraction;</w:t>
+      </w:r>
+    </w:p>
+    <w:p>
+      <w:pPr>
+        <w:spacing w:after="0"/>
+      </w:pPr>
+      <w:r>
+        <w:t>- visual density;</w:t>
+      </w:r>
+    </w:p>
+    <w:p>
+      <w:pPr>
+        <w:spacing w:after="0"/>
+      </w:pPr>
+      <w:r>
+        <w:t>- flatness;</w:t>
+      </w:r>
+    </w:p>
+    <w:p>
+      <w:pPr>
+        <w:spacing w:after="0"/>
+      </w:pPr>
+      <w:r>
+        <w:t>- white background;</w:t>
+      </w:r>
+    </w:p>
+    <w:p>
+      <w:pPr>
+        <w:spacing w:after="0"/>
+      </w:pPr>
+      <w:r>
+        <w:t>- overall scale;</w:t>
+      </w:r>
+    </w:p>
+    <w:p>
+      <w:pPr>
+        <w:spacing w:after="0"/>
+      </w:pPr>
+      <w:r>
+        <w:t>- margin;</w:t>
+      </w:r>
+    </w:p>
+    <w:p>
+      <w:pPr>
+        <w:spacing w:after="0"/>
+      </w:pPr>
+      <w:r>
+        <w:t>- level of biological detail.</w:t>
+      </w:r>
+    </w:p>
+    <w:p>
+      <w:pPr/>
+    </w:p>
+    <w:p>
+      <w:pPr>
+        <w:spacing w:after="0"/>
+      </w:pPr>
+      <w:r>
+        <w:t>The PATHWAY changes.</w:t>
+      </w:r>
+    </w:p>
+    <w:p>
+      <w:pPr/>
+    </w:p>
+    <w:p>
+      <w:pPr>
+        <w:spacing w:after="0"/>
+      </w:pPr>
+      <w:r>
+        <w:t>The STYLE does not.</w:t>
+      </w:r>
+    </w:p>
+    <w:p>
+      <w:pPr/>
+    </w:p>
+    <w:p>
+      <w:pPr>
+        <w:spacing w:after="0"/>
+      </w:pPr>
+      <w:r>
+        <w:t>Different RCDs should be distinguished mainly by:</w:t>
+      </w:r>
+    </w:p>
+    <w:p>
+      <w:pPr/>
+    </w:p>
+    <w:p>
+      <w:pPr>
+        <w:spacing w:after="0"/>
+      </w:pPr>
+      <w:r>
+        <w:t>- cell morphology;</w:t>
+      </w:r>
+    </w:p>
+    <w:p>
+      <w:pPr>
+        <w:spacing w:after="0"/>
+      </w:pPr>
+      <w:r>
+        <w:t>- defining structural event;</w:t>
+      </w:r>
+    </w:p>
+    <w:p>
+      <w:pPr>
+        <w:spacing w:after="0"/>
+      </w:pPr>
+      <w:r>
+        <w:t>- extracellular behavior;</w:t>
+      </w:r>
+    </w:p>
+    <w:p>
+      <w:pPr>
+        <w:spacing w:after="0"/>
+      </w:pPr>
+      <w:r>
+        <w:t>- specific organelle alteration;</w:t>
+      </w:r>
+    </w:p>
+    <w:p>
+      <w:pPr>
+        <w:spacing w:after="0"/>
+      </w:pPr>
+      <w:r>
+        <w:t>- silhouette;</w:t>
+      </w:r>
+    </w:p>
+    <w:p>
+      <w:pPr>
+        <w:spacing w:after="0"/>
+      </w:pPr>
+      <w:r>
+        <w:t>- dominant color family.</w:t>
+      </w:r>
+    </w:p>
+    <w:p>
+      <w:pPr/>
+    </w:p>
+    <w:p>
+      <w:pPr>
+        <w:spacing w:after="0"/>
+      </w:pPr>
+      <w:r>
+        <w:t>They must NOT be distinguished by changing illustration style.</w:t>
+      </w:r>
+    </w:p>
+    <w:p>
+      <w:pPr/>
+    </w:p>
+    <w:p>
+      <w:pPr>
+        <w:spacing w:after="0"/>
+      </w:pPr>
+      <w:r>
+        <w:t>==================================================</w:t>
+      </w:r>
+    </w:p>
+    <w:p>
+      <w:pPr>
+        <w:spacing w:after="0"/>
+      </w:pPr>
+      <w:r>
+        <w:t>FINAL QUALITY CONTROL</w:t>
+      </w:r>
+    </w:p>
+    <w:p>
+      <w:pPr>
+        <w:spacing w:after="0"/>
+      </w:pPr>
+      <w:r>
+        <w:t>==================================================</w:t>
+      </w:r>
+    </w:p>
+    <w:p>
+      <w:pPr/>
+    </w:p>
+    <w:p>
+      <w:pPr>
+        <w:spacing w:after="0"/>
+      </w:pPr>
+      <w:r>
+        <w:t>Before generating the image, silently ask:</w:t>
+      </w:r>
+    </w:p>
+    <w:p>
+      <w:pPr/>
+    </w:p>
+    <w:p>
+      <w:pPr>
+        <w:spacing w:after="0"/>
+      </w:pPr>
+      <w:r>
+        <w:t>1. Does this look like a simple cell icon rather than a mechanistic diagram?</w:t>
+      </w:r>
+    </w:p>
+    <w:p>
+      <w:pPr>
+        <w:spacing w:after="0"/>
+      </w:pPr>
+      <w:r>
+        <w:t>2. Is there one dominant cellular phenotype?</w:t>
+      </w:r>
+    </w:p>
+    <w:p>
+      <w:pPr>
+        <w:spacing w:after="0"/>
+      </w:pPr>
+      <w:r>
+        <w:t>3. Are arrows, labels and molecular notation completely absent?</w:t>
+      </w:r>
+    </w:p>
+    <w:p>
+      <w:pPr>
+        <w:spacing w:after="0"/>
+      </w:pPr>
+      <w:r>
+        <w:t>4. Is the illustration strictly flat 2D?</w:t>
+      </w:r>
+    </w:p>
+    <w:p>
+      <w:pPr>
+        <w:spacing w:after="0"/>
+      </w:pPr>
+      <w:r>
+        <w:t>5. Is the outline thick, smooth and rounded?</w:t>
+      </w:r>
+    </w:p>
+    <w:p>
+      <w:pPr>
+        <w:spacing w:after="0"/>
+      </w:pPr>
+      <w:r>
+        <w:t>6. Is the palette restrained, preferably one dominant color family?</w:t>
+      </w:r>
+    </w:p>
+    <w:p>
+      <w:pPr>
+        <w:spacing w:after="0"/>
+      </w:pPr>
+      <w:r>
+        <w:t>7. Are internal organelles simple and secondary?</w:t>
+      </w:r>
+    </w:p>
+    <w:p>
+      <w:pPr>
+        <w:spacing w:after="0"/>
+      </w:pPr>
+      <w:r>
+        <w:t>8. Could this image sit beside a blue, green, red, brown, purple or pink version of the same visual family without looking stylistically different?</w:t>
+      </w:r>
+    </w:p>
+    <w:p>
+      <w:pPr>
+        <w:spacing w:after="0"/>
+      </w:pPr>
+      <w:r>
+        <w:t>9. Is the biological hallmark recognizable without text?</w:t>
+      </w:r>
+    </w:p>
+    <w:p>
+      <w:pPr>
+        <w:spacing w:after="0"/>
+      </w:pPr>
+      <w:r>
+        <w:t>10. Would the icon remain readable when strongly reduced in size?</w:t>
+      </w:r>
+    </w:p>
+    <w:p>
+      <w:pPr/>
+    </w:p>
+    <w:p>
+      <w:pPr>
+        <w:spacing w:after="0"/>
+      </w:pPr>
+      <w:r>
+        <w:t>If any answer is NO, simplify and correct the image before generating it.</w:t>
+      </w:r>
+    </w:p>
+    <w:p>
+      <w:pPr/>
+    </w:p>
+    <w:p>
+      <w:pPr>
+        <w:spacing w:after="0"/>
+      </w:pPr>
+      <w:r>
+        <w:t>==================================================</w:t>
+      </w:r>
+    </w:p>
+    <w:p>
+      <w:pPr>
+        <w:spacing w:after="0"/>
+      </w:pPr>
+      <w:r>
+        <w:t>OUTPUT</w:t>
+      </w:r>
+    </w:p>
+    <w:p>
+      <w:pPr>
+        <w:spacing w:after="0"/>
+      </w:pPr>
+      <w:r>
+        <w:t>==================================================</w:t>
+      </w:r>
+    </w:p>
+    <w:p>
+      <w:pPr/>
+    </w:p>
+    <w:p>
+      <w:pPr>
+        <w:spacing w:after="0"/>
+      </w:pPr>
+      <w:r>
+        <w:t>ONE isolated RCD scientific icon.</w:t>
+      </w:r>
+    </w:p>
+    <w:p>
+      <w:pPr>
+        <w:spacing w:after="0"/>
+      </w:pPr>
+      <w:r>
+        <w:t>Square canvas.</w:t>
+      </w:r>
+    </w:p>
+    <w:p>
+      <w:pPr>
+        <w:spacing w:after="0"/>
+      </w:pPr>
+      <w:r>
+        <w:t>Pure white background.</w:t>
+      </w:r>
+    </w:p>
+    <w:p>
+      <w:pPr>
+        <w:spacing w:after="0"/>
+      </w:pPr>
+      <w:r>
+        <w:t>Centered composition.</w:t>
+      </w:r>
+    </w:p>
+    <w:p>
+      <w:pPr>
+        <w:spacing w:after="0"/>
+      </w:pPr>
+      <w:r>
+        <w:t>Large cellular subject.</w:t>
+      </w:r>
+    </w:p>
+    <w:p>
+      <w:pPr>
+        <w:spacing w:after="0"/>
+      </w:pPr>
+      <w:r>
+        <w:t>Generous clean margin.</w:t>
+      </w:r>
+    </w:p>
+    <w:p>
+      <w:pPr>
+        <w:spacing w:after="0"/>
+      </w:pPr>
+      <w:r>
+        <w:t>Flat 2D vector.</w:t>
+      </w:r>
+    </w:p>
+    <w:p>
+      <w:pPr>
+        <w:spacing w:after="0"/>
+      </w:pPr>
+      <w:r>
+        <w:t>Soft rounded shapes.</w:t>
+      </w:r>
+    </w:p>
+    <w:p>
+      <w:pPr>
+        <w:spacing w:after="0"/>
+      </w:pPr>
+      <w:r>
+        <w:t>Thick smooth colored outlines.</w:t>
+      </w:r>
+    </w:p>
+    <w:p>
+      <w:pPr>
+        <w:spacing w:after="0"/>
+      </w:pPr>
+      <w:r>
+        <w:t>Restrained palette.</w:t>
+      </w:r>
+    </w:p>
+    <w:p>
+      <w:pPr>
+        <w:spacing w:after="0"/>
+      </w:pPr>
+      <w:r>
+        <w:t>Minimalist biomedical cartoon style.</w:t>
+      </w:r>
+    </w:p>
+    <w:p>
+      <w:pPr>
+        <w:spacing w:after="0"/>
+      </w:pPr>
+      <w:r>
+        <w:t>Publication-quality consistency.</w:t>
+      </w:r>
+    </w:p>
+    <w:p>
+      <w:pPr/>
+    </w:p>
+    <w:p>
+      <w:pPr>
+        <w:spacing w:after="0"/>
+      </w:pPr>
+      <w:r>
+        <w:t>PATHWAY DESCRIPTION:</w:t>
+      </w:r>
+    </w:p>
+    <w:p>
+      <w:pPr/>
+    </w:p>
+    <w:p>
+      <w:pPr>
+        <w:spacing w:after="0"/>
+      </w:pPr>
+      <w:r>
+        <w:t>[PASTE THE COMPLETE RCD DESCRIPTION HERE]</w:t>
+      </w:r>
     </w:p>
     <w:p>
       <w:pPr>

</xml_diff>